<commit_message>
Sync local repo with README from GitHub
</commit_message>
<xml_diff>
--- a/How to Run efficient_frontier.py.docx
+++ b/How to Run efficient_frontier.py.docx
@@ -19,15 +19,6 @@
     </w:p>
     <w:p>
       <w:r>
-        <w:rPr>
-          <w:i/>
-          <w:iCs/>
-        </w:rPr>
-        <w:t>(Beginner Guide – No Coding Experience Needed)</w:t>
-      </w:r>
-    </w:p>
-    <w:p>
-      <w:r>
         <w:t xml:space="preserve">You will receive </w:t>
       </w:r>
       <w:r>
@@ -38,7 +29,7 @@
         <w:t>two files</w:t>
       </w:r>
       <w:r>
-        <w:t xml:space="preserve"> from the group:</w:t>
+        <w:t>:</w:t>
       </w:r>
     </w:p>
     <w:p>
@@ -264,20 +255,11 @@
           <w:b/>
           <w:bCs/>
         </w:rPr>
-        <w:t>“Install Now</w:t>
-      </w:r>
-      <w:proofErr w:type="gramStart"/>
-      <w:r>
-        <w:rPr>
-          <w:b/>
-          <w:bCs/>
-        </w:rPr>
-        <w:t>”</w:t>
+        <w:t>“Install Now”</w:t>
       </w:r>
       <w:r>
         <w:t>.</w:t>
       </w:r>
-      <w:proofErr w:type="gramEnd"/>
     </w:p>
     <w:p>
       <w:pPr>
@@ -412,21 +394,13 @@
     </w:p>
     <w:p>
       <w:r>
+        <w:t>You should see a pip version.</w:t>
+      </w:r>
+    </w:p>
+    <w:p>
+      <w:r>
         <w:lastRenderedPageBreak/>
-        <w:t>You should see a pip version.</w:t>
-      </w:r>
-    </w:p>
-    <w:p>
-      <w:r>
-        <w:t>If either one says “not recognized</w:t>
-      </w:r>
-      <w:proofErr w:type="gramStart"/>
-      <w:r>
-        <w:t>”,</w:t>
-      </w:r>
-      <w:proofErr w:type="gramEnd"/>
-      <w:r>
-        <w:t xml:space="preserve"> reinstall Python and make sure </w:t>
+        <w:t xml:space="preserve">If either one says “not recognized”, reinstall Python and make sure </w:t>
       </w:r>
       <w:r>
         <w:rPr>
@@ -473,11 +447,9 @@
           <w:numId w:val="5"/>
         </w:numPr>
       </w:pPr>
-      <w:proofErr w:type="spellStart"/>
       <w:r>
         <w:t>numpy</w:t>
       </w:r>
-      <w:proofErr w:type="spellEnd"/>
     </w:p>
     <w:p>
       <w:pPr>
@@ -508,11 +480,9 @@
           <w:numId w:val="5"/>
         </w:numPr>
       </w:pPr>
-      <w:proofErr w:type="spellStart"/>
       <w:r>
         <w:t>scipy</w:t>
       </w:r>
-      <w:proofErr w:type="spellEnd"/>
     </w:p>
     <w:p>
       <w:r>
@@ -531,21 +501,8 @@
     </w:p>
     <w:p>
       <w:r>
-        <w:t xml:space="preserve">pip install </w:t>
-      </w:r>
-      <w:proofErr w:type="spellStart"/>
-      <w:r>
-        <w:t>numpy</w:t>
-      </w:r>
-      <w:proofErr w:type="spellEnd"/>
-      <w:r>
-        <w:t xml:space="preserve"> pandas matplotlib </w:t>
-      </w:r>
-      <w:proofErr w:type="spellStart"/>
-      <w:r>
-        <w:t>scipy</w:t>
-      </w:r>
-      <w:proofErr w:type="spellEnd"/>
+        <w:t>pip install numpy pandas matplotlib scipy</w:t>
+      </w:r>
     </w:p>
     <w:p>
       <w:r>
@@ -575,13 +532,8 @@
       </w:r>
     </w:p>
     <w:p>
-      <w:proofErr w:type="gramStart"/>
-      <w:r>
-        <w:t>We’re</w:t>
-      </w:r>
-      <w:proofErr w:type="gramEnd"/>
-      <w:r>
-        <w:t xml:space="preserve"> going to put everything in a folder right on your Desktop.</w:t>
+      <w:r>
+        <w:t>We’re going to put everything in a folder right on your Desktop.</w:t>
       </w:r>
     </w:p>
     <w:p>
@@ -675,15 +627,7 @@
     </w:p>
     <w:p>
       <w:r>
-        <w:t>(Windows replaces &lt;</w:t>
-      </w:r>
-      <w:proofErr w:type="spellStart"/>
-      <w:r>
-        <w:t>YourName</w:t>
-      </w:r>
-      <w:proofErr w:type="spellEnd"/>
-      <w:r>
-        <w:t>&gt; with your actual username.)</w:t>
+        <w:t>(Windows replaces &lt;YourName&gt; with your actual username.)</w:t>
       </w:r>
     </w:p>
     <w:p>
@@ -714,7 +658,6 @@
         </w:numPr>
       </w:pPr>
       <w:r>
-        <w:lastRenderedPageBreak/>
         <w:t>efficient_frontier.py</w:t>
       </w:r>
     </w:p>
@@ -726,6 +669,7 @@
         </w:numPr>
       </w:pPr>
       <w:r>
+        <w:lastRenderedPageBreak/>
         <w:t>prices.csv</w:t>
       </w:r>
     </w:p>
@@ -825,15 +769,7 @@
         </w:numPr>
       </w:pPr>
       <w:r>
-        <w:t>Type this command (copy/paste is fine), replacing &lt;</w:t>
-      </w:r>
-      <w:proofErr w:type="spellStart"/>
-      <w:r>
-        <w:t>YourName</w:t>
-      </w:r>
-      <w:proofErr w:type="spellEnd"/>
-      <w:r>
-        <w:t>&gt; with your actual Windows username:</w:t>
+        <w:t>Type this command (copy/paste is fine), replacing &lt;YourName&gt; with your actual Windows username:</w:t>
       </w:r>
     </w:p>
     <w:p>
@@ -997,7 +933,6 @@
         </w:numPr>
       </w:pPr>
       <w:r>
-        <w:lastRenderedPageBreak/>
         <w:t>Each chart shows:</w:t>
       </w:r>
     </w:p>
@@ -1009,6 +944,7 @@
         </w:numPr>
       </w:pPr>
       <w:r>
+        <w:lastRenderedPageBreak/>
         <w:t>A cloud of random portfolios.</w:t>
       </w:r>
     </w:p>
@@ -1194,19 +1130,10 @@
         <w:t>efficient_frontier_with_shorting.png</w:t>
       </w:r>
     </w:p>
-    <w:p>
-      <w:r>
-        <w:t xml:space="preserve">These are the images </w:t>
-      </w:r>
-      <w:proofErr w:type="gramStart"/>
-      <w:r>
-        <w:t>we’ll</w:t>
-      </w:r>
-      <w:proofErr w:type="gramEnd"/>
-      <w:r>
-        <w:t xml:space="preserve"> use in the write-up / slides.</w:t>
-      </w:r>
-    </w:p>
+    <w:p/>
+    <w:p/>
+    <w:p/>
+    <w:p/>
     <w:p>
       <w:r>
         <w:pict w14:anchorId="1BDC7E30">
@@ -1226,7 +1153,7 @@
           <w:b/>
           <w:bCs/>
         </w:rPr>
-        <w:t>6. Quick troubleshooting</w:t>
+        <w:t>Quick troubleshooting</w:t>
       </w:r>
     </w:p>
     <w:p>
@@ -1303,75 +1230,20 @@
           <w:b/>
           <w:bCs/>
         </w:rPr>
-        <w:t xml:space="preserve">B) </w:t>
-      </w:r>
-      <w:proofErr w:type="spellStart"/>
-      <w:r>
-        <w:rPr>
-          <w:b/>
-          <w:bCs/>
-        </w:rPr>
-        <w:t>ModuleNotFoundError</w:t>
-      </w:r>
-      <w:proofErr w:type="spellEnd"/>
-      <w:r>
-        <w:rPr>
-          <w:b/>
-          <w:bCs/>
-        </w:rPr>
-        <w:t xml:space="preserve">: No module named 'pandas' (or </w:t>
-      </w:r>
-      <w:proofErr w:type="spellStart"/>
-      <w:r>
-        <w:rPr>
-          <w:b/>
-          <w:bCs/>
-        </w:rPr>
-        <w:t>numpy</w:t>
-      </w:r>
-      <w:proofErr w:type="spellEnd"/>
-      <w:r>
-        <w:rPr>
-          <w:b/>
-          <w:bCs/>
-        </w:rPr>
-        <w:t>/matplotlib/</w:t>
-      </w:r>
-      <w:proofErr w:type="spellStart"/>
-      <w:r>
-        <w:rPr>
-          <w:b/>
-          <w:bCs/>
-        </w:rPr>
-        <w:t>scipy</w:t>
-      </w:r>
-      <w:proofErr w:type="spellEnd"/>
-      <w:r>
-        <w:rPr>
-          <w:b/>
-          <w:bCs/>
-        </w:rPr>
-        <w:t>)</w:t>
-      </w:r>
-    </w:p>
-    <w:p>
-      <w:r>
-        <w:rPr>
-          <w:b/>
-          <w:bCs/>
-        </w:rPr>
+        <w:t>B) ModuleNotFoundError: No module named 'pandas' (or numpy/matplotlib/scipy)</w:t>
+      </w:r>
+    </w:p>
+    <w:p>
+      <w:r>
+        <w:rPr>
+          <w:b/>
+          <w:bCs/>
+        </w:rPr>
+        <w:lastRenderedPageBreak/>
         <w:t>Cause:</w:t>
       </w:r>
       <w:r>
-        <w:t xml:space="preserve"> The libraries </w:t>
-      </w:r>
-      <w:proofErr w:type="gramStart"/>
-      <w:r>
-        <w:t>aren’t</w:t>
-      </w:r>
-      <w:proofErr w:type="gramEnd"/>
-      <w:r>
-        <w:t xml:space="preserve"> installed.</w:t>
+        <w:t xml:space="preserve"> The libraries aren’t installed.</w:t>
       </w:r>
       <w:r>
         <w:br/>
@@ -1389,25 +1261,11 @@
     </w:p>
     <w:p>
       <w:r>
-        <w:t xml:space="preserve">pip install </w:t>
-      </w:r>
-      <w:proofErr w:type="spellStart"/>
-      <w:r>
-        <w:t>numpy</w:t>
-      </w:r>
-      <w:proofErr w:type="spellEnd"/>
-      <w:r>
-        <w:t xml:space="preserve"> pandas matplotlib </w:t>
-      </w:r>
-      <w:proofErr w:type="spellStart"/>
-      <w:r>
-        <w:t>scipy</w:t>
-      </w:r>
-      <w:proofErr w:type="spellEnd"/>
-    </w:p>
-    <w:p>
-      <w:r>
-        <w:lastRenderedPageBreak/>
+        <w:t>pip install numpy pandas matplotlib scipy</w:t>
+      </w:r>
+    </w:p>
+    <w:p>
+      <w:r>
         <w:pict w14:anchorId="10300724">
           <v:rect id="_x0000_i1032" style="width:0;height:1.5pt" o:hralign="center" o:hrstd="t" o:hr="t" fillcolor="#a0a0a0" stroked="f"/>
         </w:pict>
@@ -1425,39 +1283,7 @@
           <w:b/>
           <w:bCs/>
         </w:rPr>
-        <w:t xml:space="preserve">C) </w:t>
-      </w:r>
-      <w:proofErr w:type="spellStart"/>
-      <w:r>
-        <w:rPr>
-          <w:b/>
-          <w:bCs/>
-        </w:rPr>
-        <w:t>FileNotFoundError</w:t>
-      </w:r>
-      <w:proofErr w:type="spellEnd"/>
-      <w:r>
-        <w:rPr>
-          <w:b/>
-          <w:bCs/>
-        </w:rPr>
-        <w:t>: [</w:t>
-      </w:r>
-      <w:proofErr w:type="spellStart"/>
-      <w:r>
-        <w:rPr>
-          <w:b/>
-          <w:bCs/>
-        </w:rPr>
-        <w:t>Errno</w:t>
-      </w:r>
-      <w:proofErr w:type="spellEnd"/>
-      <w:r>
-        <w:rPr>
-          <w:b/>
-          <w:bCs/>
-        </w:rPr>
-        <w:t xml:space="preserve"> 2] No such file or directory: 'prices.csv'</w:t>
+        <w:t>C) FileNotFoundError: [Errno 2] No such file or directory: 'prices.csv'</w:t>
       </w:r>
     </w:p>
     <w:p>
@@ -1523,15 +1349,7 @@
         </w:numPr>
       </w:pPr>
       <w:r>
-        <w:t xml:space="preserve">Make sure </w:t>
-      </w:r>
-      <w:proofErr w:type="gramStart"/>
-      <w:r>
-        <w:t>you</w:t>
-      </w:r>
-      <w:proofErr w:type="gramEnd"/>
-      <w:r>
-        <w:t xml:space="preserve"> cd into that exact folder before running:</w:t>
+        <w:t>Make sure you cd into that exact folder before running:</w:t>
       </w:r>
     </w:p>
     <w:p>

</xml_diff>